<commit_message>
Arquitectura F6 aprobada; DAF v1.2 e historias v1.1 sin arquitectura B
- Documento de arquitectura v1.0 con 11 ADRs (Markdown para la Wiki),
  8 diagramas y gate F6 cumplido: R-01 cerrado (arquitectura B fuera de
  la versión 1) y R-02 aceptado hasta el resultado de HU-01.
- DAF v1.2: RNF-Comp-01, RF-04 y RN-19 dejan la arquitectura B fuera de
  la versión 1.
- Historias v1.1: HU-57 pasa a rechazar la arquitectura B (2 SP); 327 SP.

Co-Authored-By: Claude Opus 5.5 <noreply@anthropic.com>
</commit_message>
<xml_diff>
--- a/docs/02-analisis-funcional/Analisis_Funcional_Acelerador_Consolidacion_BPC_CM_Consulting.docx
+++ b/docs/02-analisis-funcional/Analisis_Funcional_Acelerador_Consolidacion_BPC_CM_Consulting.docx
@@ -626,6 +626,112 @@
                 <w:szCs w:val="21"/>
               </w:rPr>
               <w:t xml:space="preserve">Amplía las reglas de consolidación y el control del cierre (RF-31 a RF-39, RN-13 a RN-18, RNF-Comp-05, RNF-Aud-02, reportes C01 a C04) y agrega la variante BW/4HANA con BPC 2021. Sin preguntas críticas abiertas.</w:t>
+            </w:r>
+          </w:p>
+        </w:tc>
+      </w:tr>
+      <w:tr>
+        <w:tc>
+          <w:tcPr>
+            <w:tcW w:w="1200" w:type="dxa"/>
+            <w:tcMar>
+              <w:top w:w="80" w:type="dxa"/>
+              <w:left w:w="120" w:type="dxa"/>
+              <w:bottom w:w="80" w:type="dxa"/>
+              <w:right w:w="120" w:type="dxa"/>
+            </w:tcMar>
+            <w:vAlign w:val="center"/>
+          </w:tcPr>
+          <w:p>
+            <w:pPr>
+              <w:spacing w:after="0"/>
+              <w:jc w:val="both"/>
+            </w:pPr>
+            <w:r>
+              <w:rPr>
+                <w:rFonts w:ascii="Ubuntu" w:hAnsi="Ubuntu" w:cs="Ubuntu"/>
+                <w:sz w:val="21"/>
+                <w:szCs w:val="21"/>
+              </w:rPr>
+              <w:t xml:space="preserve">1.2</w:t>
+            </w:r>
+          </w:p>
+        </w:tc>
+        <w:tc>
+          <w:tcPr>
+            <w:tcW w:w="2200" w:type="dxa"/>
+            <w:tcMar>
+              <w:top w:w="80" w:type="dxa"/>
+              <w:left w:w="120" w:type="dxa"/>
+              <w:bottom w:w="80" w:type="dxa"/>
+              <w:right w:w="120" w:type="dxa"/>
+            </w:tcMar>
+            <w:vAlign w:val="center"/>
+          </w:tcPr>
+          <w:p>
+            <w:pPr>
+              <w:spacing w:after="0"/>
+              <w:jc w:val="both"/>
+            </w:pPr>
+            <w:r>
+              <w:rPr>
+                <w:rFonts w:ascii="Ubuntu" w:hAnsi="Ubuntu" w:cs="Ubuntu"/>
+                <w:sz w:val="21"/>
+                <w:szCs w:val="21"/>
+              </w:rPr>
+              <w:t xml:space="preserve">CM Consulting</w:t>
+            </w:r>
+          </w:p>
+        </w:tc>
+        <w:tc>
+          <w:tcPr>
+            <w:tcW w:w="1500" w:type="dxa"/>
+            <w:tcMar>
+              <w:top w:w="80" w:type="dxa"/>
+              <w:left w:w="120" w:type="dxa"/>
+              <w:bottom w:w="80" w:type="dxa"/>
+              <w:right w:w="120" w:type="dxa"/>
+            </w:tcMar>
+            <w:vAlign w:val="center"/>
+          </w:tcPr>
+          <w:p>
+            <w:pPr>
+              <w:spacing w:after="0"/>
+              <w:jc w:val="both"/>
+            </w:pPr>
+            <w:r>
+              <w:rPr>
+                <w:rFonts w:ascii="Ubuntu" w:hAnsi="Ubuntu" w:cs="Ubuntu"/>
+                <w:sz w:val="21"/>
+                <w:szCs w:val="21"/>
+              </w:rPr>
+              <w:t xml:space="preserve">16-Oct-26</w:t>
+            </w:r>
+          </w:p>
+        </w:tc>
+        <w:tc>
+          <w:tcPr>
+            <w:tcW w:w="3938" w:type="dxa"/>
+            <w:tcMar>
+              <w:top w:w="80" w:type="dxa"/>
+              <w:left w:w="120" w:type="dxa"/>
+              <w:bottom w:w="80" w:type="dxa"/>
+              <w:right w:w="120" w:type="dxa"/>
+            </w:tcMar>
+            <w:vAlign w:val="center"/>
+          </w:tcPr>
+          <w:p>
+            <w:pPr>
+              <w:spacing w:after="0"/>
+              <w:jc w:val="both"/>
+            </w:pPr>
+            <w:r>
+              <w:rPr>
+                <w:rFonts w:ascii="Ubuntu" w:hAnsi="Ubuntu" w:cs="Ubuntu"/>
+                <w:sz w:val="21"/>
+                <w:szCs w:val="21"/>
+              </w:rPr>
+              <w:t xml:space="preserve">La arquitectura B queda fuera de la versión 1 (RNF-Comp-01, RF-04, RN-19, alcance 2.2), tras la revisión de arquitectura F6. Sin preguntas críticas abiertas.</w:t>
             </w:r>
           </w:p>
         </w:tc>
@@ -1166,6 +1272,60 @@
                 <w:sz w:val="21"/>
                 <w:szCs w:val="21"/>
               </w:rPr>
+              <w:t xml:space="preserve">Decisión CM 16-Oct-26 (arquitectura B fuera de la versión 1)</w:t>
+            </w:r>
+          </w:p>
+        </w:tc>
+        <w:tc>
+          <w:tcPr>
+            <w:tcW w:w="5838" w:type="dxa"/>
+            <w:tcMar>
+              <w:top w:w="80" w:type="dxa"/>
+              <w:left w:w="120" w:type="dxa"/>
+              <w:bottom w:w="80" w:type="dxa"/>
+              <w:right w:w="120" w:type="dxa"/>
+            </w:tcMar>
+            <w:vAlign w:val="center"/>
+          </w:tcPr>
+          <w:p>
+            <w:pPr>
+              <w:spacing w:after="0"/>
+              <w:jc w:val="both"/>
+            </w:pPr>
+            <w:r>
+              <w:rPr>
+                <w:rFonts w:ascii="Ubuntu" w:hAnsi="Ubuntu" w:cs="Ubuntu"/>
+                <w:sz w:val="21"/>
+                <w:szCs w:val="21"/>
+              </w:rPr>
+              <w:t xml:space="preserve">Decisión de CM Consulting en la revisión de arquitectura (F6): la consolidación y los reportes EPM sobre BPC embebido no están confirmados, por lo que la versión 1 se limita a la arquitectura A.</w:t>
+            </w:r>
+          </w:p>
+        </w:tc>
+      </w:tr>
+      <w:tr>
+        <w:tc>
+          <w:tcPr>
+            <w:tcW w:w="3000" w:type="dxa"/>
+            <w:tcMar>
+              <w:top w:w="80" w:type="dxa"/>
+              <w:left w:w="120" w:type="dxa"/>
+              <w:bottom w:w="80" w:type="dxa"/>
+              <w:right w:w="120" w:type="dxa"/>
+            </w:tcMar>
+            <w:vAlign w:val="center"/>
+          </w:tcPr>
+          <w:p>
+            <w:pPr>
+              <w:spacing w:after="0"/>
+              <w:jc w:val="both"/>
+            </w:pPr>
+            <w:r>
+              <w:rPr>
+                <w:rFonts w:ascii="Ubuntu" w:hAnsi="Ubuntu" w:cs="Ubuntu"/>
+                <w:sz w:val="21"/>
+                <w:szCs w:val="21"/>
+              </w:rPr>
               <w:t xml:space="preserve">Sesión interna CM 16-Oct-26 (ampliación v1.1)</w:t>
             </w:r>
           </w:p>
@@ -1648,7 +1808,7 @@
           <w:sz w:val="22"/>
           <w:szCs w:val="22"/>
         </w:rPr>
-        <w:t xml:space="preserve">Soporte de dos arquitecturas: A (BW 7.5 o BW/4HANA con BPC modelo estándar) y B (ERP, BW y BPC integrados, con BPC modelo embebido; varias versiones por arquitectura, RNF-Comp-04).</w:t>
+        <w:t xml:space="preserve">Soporte de la arquitectura A (BW 7.5 o BW/4HANA con BPC modelo estándar), con varias versiones (RNF-Comp-04 y RNF-Comp-05). La arquitectura B se identifica pero no se soporta en la versión 1 (RN-19).</w:t>
       </w:r>
     </w:p>
     <w:p>
@@ -1667,6 +1827,31 @@
           <w:szCs w:val="28"/>
         </w:rPr>
         <w:t xml:space="preserve">2.2 Fuera del alcance</w:t>
+      </w:r>
+    </w:p>
+    <w:p>
+      <w:pPr>
+        <w:pStyle w:val="ListParagraph"/>
+        <w:numPr>
+          <w:ilvl w:val="0"/>
+          <w:numId w:val="1"/>
+        </w:numPr>
+        <w:spacing w:before="0" w:after="80" w:line="288" w:lineRule="auto"/>
+        <w:ind w:left="720" w:hanging="360"/>
+        <w:contextualSpacing/>
+        <w:jc w:val="both"/>
+        <w:rPr>
+          <w:color w:val="000000"/>
+          <w:sz w:val="22"/>
+        </w:rPr>
+      </w:pPr>
+      <w:r>
+        <w:rPr>
+          <w:rFonts w:ascii="Ubuntu" w:hAnsi="Ubuntu" w:cs="Ubuntu"/>
+          <w:sz w:val="22"/>
+          <w:szCs w:val="22"/>
+        </w:rPr>
+        <w:t xml:space="preserve">Arquitectura B (ERP, BW y BPC integrados con BPC modelo embebido) en la versión 1 (RN-19); se reevalúa para una versión posterior.</w:t>
       </w:r>
     </w:p>
     <w:p>
@@ -3656,7 +3841,7 @@
                 <w:sz w:val="21"/>
                 <w:szCs w:val="21"/>
               </w:rPr>
-              <w:t xml:space="preserve">El sistema identifica si el cliente opera la arquitectura A (ERP, BW 7.5 o BW/4HANA y BPC modelo estándar en sistemas separados) o la B (ERP, BW y BPC integrados en el mismo sistema, p. ej. S/4HANA con BW embebido y BPC embebido), y usa la variante de generación de esa arquitectura en los pasos siguientes.</w:t>
+              <w:t xml:space="preserve">El sistema identifica si el cliente opera la arquitectura A (ERP, BW 7.5 o BW/4HANA y BPC modelo estándar en sistemas separados) o la B (ERP, BW y BPC integrados en el mismo sistema, p. ej. S/4HANA con BW embebido y BPC embebido), y usa la variante de generación de esa arquitectura en los pasos siguientes. En la versión 1, si detecta la arquitectura B informa que no está soportada y no permite continuar.</w:t>
             </w:r>
           </w:p>
         </w:tc>
@@ -3682,7 +3867,7 @@
                 <w:sz w:val="21"/>
                 <w:szCs w:val="21"/>
               </w:rPr>
-              <w:t xml:space="preserve">RN-02</w:t>
+              <w:t xml:space="preserve">RN-02, RN-19</w:t>
             </w:r>
           </w:p>
         </w:tc>
@@ -3734,7 +3919,7 @@
                 <w:sz w:val="21"/>
                 <w:szCs w:val="21"/>
               </w:rPr>
-              <w:t xml:space="preserve">Sesión técnica 16-Oct-26, G6 00:00-00:43; Sesión técnica 16-Oct-26, G7 12:31-13:21</w:t>
+              <w:t xml:space="preserve">Sesión técnica 16-Oct-26, G6 00:00-00:43; Sesión técnica 16-Oct-26, G7 12:31-13:21; Decisión CM 16-Oct-26 (arquitectura B fuera de la versión 1)</w:t>
             </w:r>
           </w:p>
         </w:tc>
@@ -16243,7 +16428,7 @@
                 <w:sz w:val="21"/>
                 <w:szCs w:val="21"/>
               </w:rPr>
-              <w:t xml:space="preserve">El acelerador soporta las dos arquitecturas: A (BW 7.5 o BW/4HANA con BPC modelo estándar) y B (ERP, BW y BPC integrados, con BPC modelo embebido).</w:t>
+              <w:t xml:space="preserve">La versión 1 soporta la arquitectura A (BW 7.5 o BW/4HANA con BPC modelo estándar). La arquitectura B (ERP, BW y BPC integrados, con BPC modelo embebido) queda para una versión posterior.</w:t>
             </w:r>
           </w:p>
         </w:tc>
@@ -16269,7 +16454,7 @@
                 <w:sz w:val="21"/>
                 <w:szCs w:val="21"/>
               </w:rPr>
-              <w:t xml:space="preserve">Todos los RF aplicables a cada arquitectura se ejecutan completos en un ambiente de prueba de esa arquitectura (2 de 2).</w:t>
+              <w:t xml:space="preserve">Todos los RF se ejecutan completos en un ambiente de prueba de la arquitectura A (1 de 1); la arquitectura B se detecta y se rechaza con mensaje.</w:t>
             </w:r>
           </w:p>
         </w:tc>
@@ -16295,7 +16480,7 @@
                 <w:sz w:val="21"/>
                 <w:szCs w:val="21"/>
               </w:rPr>
-              <w:t xml:space="preserve">Sesión técnica 16-Oct-26, G7 12:47-12:57</w:t>
+              <w:t xml:space="preserve">Sesión técnica 16-Oct-26, G7 12:47-12:57; Decisión CM 16-Oct-26 (arquitectura B fuera de la versión 1)</w:t>
             </w:r>
           </w:p>
         </w:tc>
@@ -19826,6 +20011,112 @@
                 <w:szCs w:val="21"/>
               </w:rPr>
               <w:t xml:space="preserve">NIC 21 (por confirmar en la pregunta abierta 3)</w:t>
+            </w:r>
+          </w:p>
+        </w:tc>
+      </w:tr>
+      <w:tr>
+        <w:tc>
+          <w:tcPr>
+            <w:tcW w:w="900" w:type="dxa"/>
+            <w:tcMar>
+              <w:top w:w="80" w:type="dxa"/>
+              <w:left w:w="120" w:type="dxa"/>
+              <w:bottom w:w="80" w:type="dxa"/>
+              <w:right w:w="120" w:type="dxa"/>
+            </w:tcMar>
+            <w:vAlign w:val="center"/>
+          </w:tcPr>
+          <w:p>
+            <w:pPr>
+              <w:spacing w:after="0"/>
+              <w:jc w:val="both"/>
+            </w:pPr>
+            <w:r>
+              <w:rPr>
+                <w:rFonts w:ascii="Ubuntu" w:hAnsi="Ubuntu" w:cs="Ubuntu"/>
+                <w:sz w:val="21"/>
+                <w:szCs w:val="21"/>
+              </w:rPr>
+              <w:t xml:space="preserve">RN-19</w:t>
+            </w:r>
+          </w:p>
+        </w:tc>
+        <w:tc>
+          <w:tcPr>
+            <w:tcW w:w="4838" w:type="dxa"/>
+            <w:tcMar>
+              <w:top w:w="80" w:type="dxa"/>
+              <w:left w:w="120" w:type="dxa"/>
+              <w:bottom w:w="80" w:type="dxa"/>
+              <w:right w:w="120" w:type="dxa"/>
+            </w:tcMar>
+            <w:vAlign w:val="center"/>
+          </w:tcPr>
+          <w:p>
+            <w:pPr>
+              <w:spacing w:after="0"/>
+              <w:jc w:val="both"/>
+            </w:pPr>
+            <w:r>
+              <w:rPr>
+                <w:rFonts w:ascii="Ubuntu" w:hAnsi="Ubuntu" w:cs="Ubuntu"/>
+                <w:sz w:val="21"/>
+                <w:szCs w:val="21"/>
+              </w:rPr>
+              <w:t xml:space="preserve">En la versión 1 solo se generan objetos en la arquitectura A; un cliente con arquitectura B se identifica pero no se configura ni se genera.</w:t>
+            </w:r>
+          </w:p>
+        </w:tc>
+        <w:tc>
+          <w:tcPr>
+            <w:tcW w:w="1500" w:type="dxa"/>
+            <w:tcMar>
+              <w:top w:w="80" w:type="dxa"/>
+              <w:left w:w="120" w:type="dxa"/>
+              <w:bottom w:w="80" w:type="dxa"/>
+              <w:right w:w="120" w:type="dxa"/>
+            </w:tcMar>
+            <w:vAlign w:val="center"/>
+          </w:tcPr>
+          <w:p>
+            <w:pPr>
+              <w:spacing w:after="0"/>
+              <w:jc w:val="both"/>
+            </w:pPr>
+            <w:r>
+              <w:rPr>
+                <w:rFonts w:ascii="Ubuntu" w:hAnsi="Ubuntu" w:cs="Ubuntu"/>
+                <w:sz w:val="21"/>
+                <w:szCs w:val="21"/>
+              </w:rPr>
+              <w:t xml:space="preserve">RF-04</w:t>
+            </w:r>
+          </w:p>
+        </w:tc>
+        <w:tc>
+          <w:tcPr>
+            <w:tcW w:w="1600" w:type="dxa"/>
+            <w:tcMar>
+              <w:top w:w="80" w:type="dxa"/>
+              <w:left w:w="120" w:type="dxa"/>
+              <w:bottom w:w="80" w:type="dxa"/>
+              <w:right w:w="120" w:type="dxa"/>
+            </w:tcMar>
+            <w:vAlign w:val="center"/>
+          </w:tcPr>
+          <w:p>
+            <w:pPr>
+              <w:spacing w:after="0"/>
+              <w:jc w:val="both"/>
+            </w:pPr>
+            <w:r>
+              <w:rPr>
+                <w:rFonts w:ascii="Ubuntu" w:hAnsi="Ubuntu" w:cs="Ubuntu"/>
+                <w:sz w:val="21"/>
+                <w:szCs w:val="21"/>
+              </w:rPr>
+              <w:t xml:space="preserve">Decisión CM 16-Oct-26 (arquitectura B fuera de la versión 1)</w:t>
             </w:r>
           </w:p>
         </w:tc>
@@ -25544,7 +25835,7 @@
           <w:sz w:val="22"/>
           <w:szCs w:val="22"/>
         </w:rPr>
-        <w:t xml:space="preserve">Las reglas de consolidación de la sección 5.9 se generan con las funciones estándar de BPC (modelo de propiedad, reglas de negocio, asientos, bloqueo y flujo de proceso); su disponibilidad en la arquitectura B se confirma en la pregunta abierta 17.</w:t>
+        <w:t xml:space="preserve">Las reglas de consolidación de la sección 5.9 se generan con las funciones estándar de BPC (modelo de propiedad, reglas de negocio, asientos, bloqueo y flujo de proceso); la arquitectura B, donde su disponibilidad está por confirmar (pregunta abierta 17), queda fuera de la versión 1.</w:t>
       </w:r>
     </w:p>
     <w:p>
@@ -26131,112 +26422,6 @@
                 <w:szCs w:val="21"/>
               </w:rPr>
               <w:t xml:space="preserve">Bloquea la prueba técnica del mecanismo de inyección.</w:t>
-            </w:r>
-          </w:p>
-        </w:tc>
-      </w:tr>
-      <w:tr>
-        <w:tc>
-          <w:tcPr>
-            <w:tcW w:w="3000" w:type="dxa"/>
-            <w:tcMar>
-              <w:top w:w="80" w:type="dxa"/>
-              <w:left w:w="120" w:type="dxa"/>
-              <w:bottom w:w="80" w:type="dxa"/>
-              <w:right w:w="120" w:type="dxa"/>
-            </w:tcMar>
-            <w:vAlign w:val="center"/>
-          </w:tcPr>
-          <w:p>
-            <w:pPr>
-              <w:spacing w:after="0"/>
-              <w:jc w:val="both"/>
-            </w:pPr>
-            <w:r>
-              <w:rPr>
-                <w:rFonts w:ascii="Ubuntu" w:hAnsi="Ubuntu" w:cs="Ubuntu"/>
-                <w:sz w:val="21"/>
-                <w:szCs w:val="21"/>
-              </w:rPr>
-              <w:t xml:space="preserve">Ambiente de arquitectura B para pruebas</w:t>
-            </w:r>
-          </w:p>
-        </w:tc>
-        <w:tc>
-          <w:tcPr>
-            <w:tcW w:w="1800" w:type="dxa"/>
-            <w:tcMar>
-              <w:top w:w="80" w:type="dxa"/>
-              <w:left w:w="120" w:type="dxa"/>
-              <w:bottom w:w="80" w:type="dxa"/>
-              <w:right w:w="120" w:type="dxa"/>
-            </w:tcMar>
-            <w:vAlign w:val="center"/>
-          </w:tcPr>
-          <w:p>
-            <w:pPr>
-              <w:spacing w:after="0"/>
-              <w:jc w:val="both"/>
-            </w:pPr>
-            <w:r>
-              <w:rPr>
-                <w:rFonts w:ascii="Ubuntu" w:hAnsi="Ubuntu" w:cs="Ubuntu"/>
-                <w:sz w:val="21"/>
-                <w:szCs w:val="21"/>
-              </w:rPr>
-              <w:t xml:space="preserve">CM Consulting – Dirección</w:t>
-            </w:r>
-          </w:p>
-        </w:tc>
-        <w:tc>
-          <w:tcPr>
-            <w:tcW w:w="1400" w:type="dxa"/>
-            <w:tcMar>
-              <w:top w:w="80" w:type="dxa"/>
-              <w:left w:w="120" w:type="dxa"/>
-              <w:bottom w:w="80" w:type="dxa"/>
-              <w:right w:w="120" w:type="dxa"/>
-            </w:tcMar>
-            <w:vAlign w:val="center"/>
-          </w:tcPr>
-          <w:p>
-            <w:pPr>
-              <w:spacing w:after="0"/>
-              <w:jc w:val="both"/>
-            </w:pPr>
-            <w:r>
-              <w:rPr>
-                <w:rFonts w:ascii="Ubuntu" w:hAnsi="Ubuntu" w:cs="Ubuntu"/>
-                <w:sz w:val="21"/>
-                <w:szCs w:val="21"/>
-              </w:rPr>
-              <w:t xml:space="preserve">Por definir</w:t>
-            </w:r>
-          </w:p>
-        </w:tc>
-        <w:tc>
-          <w:tcPr>
-            <w:tcW w:w="2638" w:type="dxa"/>
-            <w:tcMar>
-              <w:top w:w="80" w:type="dxa"/>
-              <w:left w:w="120" w:type="dxa"/>
-              <w:bottom w:w="80" w:type="dxa"/>
-              <w:right w:w="120" w:type="dxa"/>
-            </w:tcMar>
-            <w:vAlign w:val="center"/>
-          </w:tcPr>
-          <w:p>
-            <w:pPr>
-              <w:spacing w:after="0"/>
-              <w:jc w:val="both"/>
-            </w:pPr>
-            <w:r>
-              <w:rPr>
-                <w:rFonts w:ascii="Ubuntu" w:hAnsi="Ubuntu" w:cs="Ubuntu"/>
-                <w:sz w:val="21"/>
-                <w:szCs w:val="21"/>
-              </w:rPr>
-              <w:t xml:space="preserve">Bloquea RNF-Comp-01 para la segunda arquitectura.</w:t>
             </w:r>
           </w:p>
         </w:tc>
@@ -28181,7 +28366,7 @@
                 <w:sz w:val="21"/>
                 <w:szCs w:val="21"/>
               </w:rPr>
-              <w:t xml:space="preserve">¿EPM add-in sirve como herramienta de reportes con BPC modelo embebido (arquitectura B), donde SAP orienta hacia Analysis for Office?</w:t>
+              <w:t xml:space="preserve">Para una versión posterior (B fuera de la versión 1): ¿EPM add-in sirve como herramienta de reportes con BPC modelo embebido (arquitectura B), donde SAP orienta hacia Analysis for Office?</w:t>
             </w:r>
           </w:p>
         </w:tc>
@@ -28709,7 +28894,7 @@
                 <w:sz w:val="21"/>
                 <w:szCs w:val="21"/>
               </w:rPr>
-              <w:t xml:space="preserve">¿Los asientos de ajuste (RF-35), el bloqueo por sociedad (RF-37) y el flujo de cierre (RF-38) están disponibles en BPC modelo embebido (arquitectura B) en las versiones de la matriz de soporte?</w:t>
+              <w:t xml:space="preserve">Para una versión posterior (B fuera de la versión 1): ¿los asientos de ajuste (RF-35), el bloqueo por sociedad (RF-37) y el flujo de cierre (RF-38) están disponibles en BPC modelo embebido (arquitectura B)?</w:t>
             </w:r>
           </w:p>
         </w:tc>

</xml_diff>